<commit_message>
Clarify Ollama and LLM responsibilities
</commit_message>
<xml_diff>
--- a/docs/Kaggle-Slaying_Documentacao_Tecnica_e_Tutorial.docx
+++ b/docs/Kaggle-Slaying_Documentacao_Tecnica_e_Tutorial.docx
@@ -111,7 +111,7 @@
           <w:color w:val="24313D"/>
           <w:sz w:val="22"/>
         </w:rPr>
-        <w:t>O Kaggle-Slaying Multi-Agent Team e um MVP local que automatiza o ciclo de competicoes Kaggle tabulares. A equipe de agentes descobre oportunidades, inspeciona dados, compara modelos, valida a submissao e acompanha o leaderboard. O envio continua sob aprovacao humana.</w:t>
+        <w:t>O Kaggle-Slaying Multi-Agent Team e um MVP local que automatiza o ciclo de competicoes Kaggle tabulares. A equipe de agentes descobre oportunidades, inspeciona dados, compara modelos, valida a submissao e acompanha o leaderboard. Ollama esta instalado como infraestrutura local para uma futura camada consultiva de LLM; ele ainda nao participa do caminho principal. O envio continua sob aprovacao humana.</w:t>
       </w:r>
     </w:p>
     <w:tbl>
@@ -674,8 +674,62 @@
           <w:color w:val="24313D"/>
           <w:sz w:val="22"/>
         </w:rPr>
-        <w:t>Ollama permanece opcional: validacoes criticas sao deterministicas e testaveis.</w:t>
+        <w:t>Ollama permanece opcional: a v0.1 funciona mesmo com o servico desligado, pois validacoes criticas sao deterministicas e testaveis.</w:t>
       </w:r>
+    </w:p>
+    <w:tbl>
+      <w:tblPr>
+        <w:jc w:val="left"/>
+        <w:tblLook w:firstColumn="1" w:firstRow="1" w:lastColumn="0" w:lastRow="0" w:noHBand="0" w:noVBand="1" w:val="04A0"/>
+        <w:tblW w:w="9360" w:type="dxa"/>
+        <w:tblInd w:w="120" w:type="dxa"/>
+        <w:tblLayout w:type="fixed"/>
+      </w:tblPr>
+      <w:tblGrid>
+        <w:gridCol w:w="9360"/>
+      </w:tblGrid>
+      <w:tr>
+        <w:tc>
+          <w:tcPr>
+            <w:tcW w:type="dxa" w:w="9360"/>
+            <w:shd w:fill="F1ECFA"/>
+            <w:vAlign w:val="center"/>
+            <w:tcMar>
+              <w:top w:w="80" w:type="dxa"/>
+              <w:start w:w="120" w:type="dxa"/>
+              <w:bottom w:w="80" w:type="dxa"/>
+              <w:end w:w="120" w:type="dxa"/>
+            </w:tcMar>
+          </w:tcPr>
+          <w:p>
+            <w:pPr>
+              <w:spacing w:after="0"/>
+            </w:pPr>
+            <w:r>
+              <w:rPr>
+                <w:rFonts w:ascii="Calibri" w:hAnsi="Calibri"/>
+                <w:b/>
+                <w:color w:val="7257A6"/>
+                <w:sz w:val="21"/>
+              </w:rPr>
+              <w:t xml:space="preserve">Agente nao significa necessariamente LLM: </w:t>
+            </w:r>
+            <w:r>
+              <w:rPr>
+                <w:rFonts w:ascii="Calibri" w:hAnsi="Calibri"/>
+                <w:color w:val="24313D"/>
+                <w:sz w:val="21"/>
+              </w:rPr>
+              <w:t>na v0.1, os agentes sao componentes Python com responsabilidade, estado, entrada e saida definidos, orquestrados por LangGraph. Uma LLM e apenas um tipo possivel de agente e foi mantida fora das decisoes criticas nesta etapa.</w:t>
+            </w:r>
+          </w:p>
+        </w:tc>
+      </w:tr>
+    </w:tbl>
+    <w:p>
+      <w:pPr>
+        <w:spacing w:after="20"/>
+      </w:pPr>
     </w:p>
     <w:p>
       <w:pPr>
@@ -1534,6 +1588,116 @@
           </w:p>
         </w:tc>
       </w:tr>
+      <w:tr>
+        <w:tc>
+          <w:tcPr>
+            <w:tcW w:type="dxa" w:w="1450"/>
+            <w:vAlign w:val="center"/>
+            <w:tcMar>
+              <w:top w:w="80" w:type="dxa"/>
+              <w:start w:w="120" w:type="dxa"/>
+              <w:bottom w:w="80" w:type="dxa"/>
+              <w:end w:w="120" w:type="dxa"/>
+            </w:tcMar>
+          </w:tcPr>
+          <w:p>
+            <w:pPr>
+              <w:spacing w:before="0" w:after="0" w:line="264" w:lineRule="auto"/>
+              <w:jc w:val="left"/>
+            </w:pPr>
+            <w:r>
+              <w:rPr>
+                <w:rFonts w:ascii="Calibri" w:hAnsi="Calibri"/>
+                <w:b w:val="0"/>
+                <w:color w:val="24313D"/>
+                <w:sz w:val="19"/>
+              </w:rPr>
+              <w:t>LLM Assistant</w:t>
+            </w:r>
+          </w:p>
+        </w:tc>
+        <w:tc>
+          <w:tcPr>
+            <w:tcW w:type="dxa" w:w="2300"/>
+            <w:vAlign w:val="center"/>
+            <w:tcMar>
+              <w:top w:w="80" w:type="dxa"/>
+              <w:start w:w="120" w:type="dxa"/>
+              <w:bottom w:w="80" w:type="dxa"/>
+              <w:end w:w="120" w:type="dxa"/>
+            </w:tcMar>
+          </w:tcPr>
+          <w:p>
+            <w:pPr>
+              <w:spacing w:before="0" w:after="0" w:line="264" w:lineRule="auto"/>
+              <w:jc w:val="left"/>
+            </w:pPr>
+            <w:r>
+              <w:rPr>
+                <w:rFonts w:ascii="Calibri" w:hAnsi="Calibri"/>
+                <w:b w:val="0"/>
+                <w:color w:val="24313D"/>
+                <w:sz w:val="19"/>
+              </w:rPr>
+              <w:t>Relatorios JSON, sem credenciais</w:t>
+            </w:r>
+          </w:p>
+        </w:tc>
+        <w:tc>
+          <w:tcPr>
+            <w:tcW w:type="dxa" w:w="3100"/>
+            <w:vAlign w:val="center"/>
+            <w:tcMar>
+              <w:top w:w="80" w:type="dxa"/>
+              <w:start w:w="120" w:type="dxa"/>
+              <w:bottom w:w="80" w:type="dxa"/>
+              <w:end w:w="120" w:type="dxa"/>
+            </w:tcMar>
+          </w:tcPr>
+          <w:p>
+            <w:pPr>
+              <w:spacing w:before="0" w:after="0" w:line="264" w:lineRule="auto"/>
+              <w:jc w:val="left"/>
+            </w:pPr>
+            <w:r>
+              <w:rPr>
+                <w:rFonts w:ascii="Calibri" w:hAnsi="Calibri"/>
+                <w:b w:val="0"/>
+                <w:color w:val="24313D"/>
+                <w:sz w:val="19"/>
+              </w:rPr>
+              <w:t>Resume e propoe hipoteses</w:t>
+            </w:r>
+          </w:p>
+        </w:tc>
+        <w:tc>
+          <w:tcPr>
+            <w:tcW w:type="dxa" w:w="2510"/>
+            <w:vAlign w:val="center"/>
+            <w:tcMar>
+              <w:top w:w="80" w:type="dxa"/>
+              <w:start w:w="120" w:type="dxa"/>
+              <w:bottom w:w="80" w:type="dxa"/>
+              <w:end w:w="120" w:type="dxa"/>
+            </w:tcMar>
+          </w:tcPr>
+          <w:p>
+            <w:pPr>
+              <w:spacing w:before="0" w:after="0" w:line="264" w:lineRule="auto"/>
+              <w:jc w:val="left"/>
+            </w:pPr>
+            <w:r>
+              <w:rPr>
+                <w:rFonts w:ascii="Calibri" w:hAnsi="Calibri"/>
+                <w:b w:val="0"/>
+                <w:color w:val="24313D"/>
+                <w:sz w:val="19"/>
+              </w:rPr>
+              <w:t>Sugestoes para revisao humana</w:t>
+            </w:r>
+          </w:p>
+        </w:tc>
+      </w:tr>
     </w:tbl>
     <w:p>
       <w:pPr>
@@ -1713,6 +1877,395 @@
         </w:rPr>
         <w:t>Depois do envio aprovado, o Monitor baixa o leaderboard, localiza o usuario e registra score, rank, total de equipes, percentual superado e distancia para o top 20%. O recibo local torna o envio idempotente: o mesmo hash nao e publicado duas vezes.</w:t>
       </w:r>
+    </w:p>
+    <w:p>
+      <w:pPr>
+        <w:pStyle w:val="Heading2"/>
+        <w:keepNext/>
+      </w:pPr>
+      <w:r>
+        <w:t>2.7 Ollama e LLMs: camada consultiva</w:t>
+      </w:r>
+    </w:p>
+    <w:p>
+      <w:r>
+        <w:rPr>
+          <w:rFonts w:ascii="Calibri" w:hAnsi="Calibri"/>
+          <w:i w:val="0"/>
+          <w:color w:val="24313D"/>
+          <w:sz w:val="22"/>
+        </w:rPr>
+        <w:t>O Ollama e o servidor local que permite executar uma LLM sem pagar por tokens e sem enviar os relatorios para um provedor externo. Na implementacao atual, o Doctor verifica se o executavel e o servico local estao disponiveis, mas nenhum comando run, submission-gate ou submit-approved chama uma LLM. Portanto, desligar o Ollama nao impede o workflow principal.</w:t>
+      </w:r>
+    </w:p>
+    <w:p>
+      <w:r>
+        <w:rPr>
+          <w:rFonts w:ascii="Calibri" w:hAnsi="Calibri"/>
+          <w:i w:val="0"/>
+          <w:color w:val="24313D"/>
+          <w:sz w:val="22"/>
+        </w:rPr>
+        <w:t>O papel planejado da LLM e consultivo: ler dataset_report.json, factory_report.json e experiment_report.json; explicar alertas; resumir resultados; sugerir novas hipoteses, features ou modelos; e preparar uma recomendacao em linguagem natural. A sugestao volta ao usuario e aos agentes deterministicos para validacao antes de qualquer mudanca.</w:t>
+      </w:r>
+    </w:p>
+    <w:tbl>
+      <w:tblPr>
+        <w:tblStyle w:val="TableGrid"/>
+        <w:jc w:val="left"/>
+        <w:tblLook w:firstColumn="1" w:firstRow="1" w:lastColumn="0" w:lastRow="0" w:noHBand="0" w:noVBand="1" w:val="04A0"/>
+        <w:tblW w:w="9360" w:type="dxa"/>
+        <w:tblInd w:w="120" w:type="dxa"/>
+        <w:tblLayout w:type="fixed"/>
+      </w:tblPr>
+      <w:tblGrid>
+        <w:gridCol w:w="2100"/>
+        <w:gridCol w:w="7260"/>
+      </w:tblGrid>
+      <w:tr>
+        <w:trPr>
+          <w:tblHeader w:val="true"/>
+        </w:trPr>
+        <w:tc>
+          <w:tcPr>
+            <w:tcW w:type="dxa" w:w="2100"/>
+            <w:shd w:fill="DCEAF7"/>
+            <w:vAlign w:val="center"/>
+            <w:tcMar>
+              <w:top w:w="80" w:type="dxa"/>
+              <w:start w:w="120" w:type="dxa"/>
+              <w:bottom w:w="80" w:type="dxa"/>
+              <w:end w:w="120" w:type="dxa"/>
+            </w:tcMar>
+          </w:tcPr>
+          <w:p>
+            <w:pPr>
+              <w:spacing w:before="0" w:after="0" w:line="264" w:lineRule="auto"/>
+              <w:jc w:val="left"/>
+            </w:pPr>
+            <w:r>
+              <w:rPr>
+                <w:rFonts w:ascii="Calibri" w:hAnsi="Calibri"/>
+                <w:b/>
+                <w:color w:val="17324D"/>
+                <w:sz w:val="19"/>
+              </w:rPr>
+              <w:t>Situacao</w:t>
+            </w:r>
+          </w:p>
+        </w:tc>
+        <w:tc>
+          <w:tcPr>
+            <w:tcW w:type="dxa" w:w="7260"/>
+            <w:shd w:fill="DCEAF7"/>
+            <w:vAlign w:val="center"/>
+            <w:tcMar>
+              <w:top w:w="80" w:type="dxa"/>
+              <w:start w:w="120" w:type="dxa"/>
+              <w:bottom w:w="80" w:type="dxa"/>
+              <w:end w:w="120" w:type="dxa"/>
+            </w:tcMar>
+          </w:tcPr>
+          <w:p>
+            <w:pPr>
+              <w:spacing w:before="0" w:after="0" w:line="264" w:lineRule="auto"/>
+              <w:jc w:val="left"/>
+            </w:pPr>
+            <w:r>
+              <w:rPr>
+                <w:rFonts w:ascii="Calibri" w:hAnsi="Calibri"/>
+                <w:b/>
+                <w:color w:val="17324D"/>
+                <w:sz w:val="19"/>
+              </w:rPr>
+              <w:t>Papel da LLM local</w:t>
+            </w:r>
+          </w:p>
+        </w:tc>
+      </w:tr>
+      <w:tr>
+        <w:tc>
+          <w:tcPr>
+            <w:tcW w:type="dxa" w:w="2100"/>
+            <w:vAlign w:val="center"/>
+            <w:tcMar>
+              <w:top w:w="80" w:type="dxa"/>
+              <w:start w:w="120" w:type="dxa"/>
+              <w:bottom w:w="80" w:type="dxa"/>
+              <w:end w:w="120" w:type="dxa"/>
+            </w:tcMar>
+          </w:tcPr>
+          <w:p>
+            <w:pPr>
+              <w:spacing w:before="0" w:after="0" w:line="264" w:lineRule="auto"/>
+              <w:jc w:val="left"/>
+            </w:pPr>
+            <w:r>
+              <w:rPr>
+                <w:rFonts w:ascii="Calibri" w:hAnsi="Calibri"/>
+                <w:b w:val="0"/>
+                <w:color w:val="24313D"/>
+                <w:sz w:val="19"/>
+              </w:rPr>
+              <w:t>Hoje</w:t>
+            </w:r>
+          </w:p>
+        </w:tc>
+        <w:tc>
+          <w:tcPr>
+            <w:tcW w:type="dxa" w:w="7260"/>
+            <w:vAlign w:val="center"/>
+            <w:tcMar>
+              <w:top w:w="80" w:type="dxa"/>
+              <w:start w:w="120" w:type="dxa"/>
+              <w:bottom w:w="80" w:type="dxa"/>
+              <w:end w:w="120" w:type="dxa"/>
+            </w:tcMar>
+          </w:tcPr>
+          <w:p>
+            <w:pPr>
+              <w:spacing w:before="0" w:after="0" w:line="264" w:lineRule="auto"/>
+              <w:jc w:val="left"/>
+            </w:pPr>
+            <w:r>
+              <w:rPr>
+                <w:rFonts w:ascii="Calibri" w:hAnsi="Calibri"/>
+                <w:b w:val="0"/>
+                <w:color w:val="24313D"/>
+                <w:sz w:val="19"/>
+              </w:rPr>
+              <w:t>Diagnosticada pelo Doctor; fora do caminho critico</w:t>
+            </w:r>
+          </w:p>
+        </w:tc>
+      </w:tr>
+      <w:tr>
+        <w:tc>
+          <w:tcPr>
+            <w:tcW w:type="dxa" w:w="2100"/>
+            <w:vAlign w:val="center"/>
+            <w:tcMar>
+              <w:top w:w="80" w:type="dxa"/>
+              <w:start w:w="120" w:type="dxa"/>
+              <w:bottom w:w="80" w:type="dxa"/>
+              <w:end w:w="120" w:type="dxa"/>
+            </w:tcMar>
+          </w:tcPr>
+          <w:p>
+            <w:pPr>
+              <w:spacing w:before="0" w:after="0" w:line="264" w:lineRule="auto"/>
+              <w:jc w:val="left"/>
+            </w:pPr>
+            <w:r>
+              <w:rPr>
+                <w:rFonts w:ascii="Calibri" w:hAnsi="Calibri"/>
+                <w:b w:val="0"/>
+                <w:color w:val="24313D"/>
+                <w:sz w:val="19"/>
+              </w:rPr>
+              <w:t>Proximo passo</w:t>
+            </w:r>
+          </w:p>
+        </w:tc>
+        <w:tc>
+          <w:tcPr>
+            <w:tcW w:type="dxa" w:w="7260"/>
+            <w:vAlign w:val="center"/>
+            <w:tcMar>
+              <w:top w:w="80" w:type="dxa"/>
+              <w:start w:w="120" w:type="dxa"/>
+              <w:bottom w:w="80" w:type="dxa"/>
+              <w:end w:w="120" w:type="dxa"/>
+            </w:tcMar>
+          </w:tcPr>
+          <w:p>
+            <w:pPr>
+              <w:spacing w:before="0" w:after="0" w:line="264" w:lineRule="auto"/>
+              <w:jc w:val="left"/>
+            </w:pPr>
+            <w:r>
+              <w:rPr>
+                <w:rFonts w:ascii="Calibri" w:hAnsi="Calibri"/>
+                <w:b w:val="0"/>
+                <w:color w:val="24313D"/>
+                <w:sz w:val="19"/>
+              </w:rPr>
+              <w:t>Resumir relatorios e propor hipoteses estruturadas</w:t>
+            </w:r>
+          </w:p>
+        </w:tc>
+      </w:tr>
+      <w:tr>
+        <w:tc>
+          <w:tcPr>
+            <w:tcW w:type="dxa" w:w="2100"/>
+            <w:vAlign w:val="center"/>
+            <w:tcMar>
+              <w:top w:w="80" w:type="dxa"/>
+              <w:start w:w="120" w:type="dxa"/>
+              <w:bottom w:w="80" w:type="dxa"/>
+              <w:end w:w="120" w:type="dxa"/>
+            </w:tcMar>
+          </w:tcPr>
+          <w:p>
+            <w:pPr>
+              <w:spacing w:before="0" w:after="0" w:line="264" w:lineRule="auto"/>
+              <w:jc w:val="left"/>
+            </w:pPr>
+            <w:r>
+              <w:rPr>
+                <w:rFonts w:ascii="Calibri" w:hAnsi="Calibri"/>
+                <w:b w:val="0"/>
+                <w:color w:val="24313D"/>
+                <w:sz w:val="19"/>
+              </w:rPr>
+              <w:t>Sempre proibido</w:t>
+            </w:r>
+          </w:p>
+        </w:tc>
+        <w:tc>
+          <w:tcPr>
+            <w:tcW w:type="dxa" w:w="7260"/>
+            <w:vAlign w:val="center"/>
+            <w:tcMar>
+              <w:top w:w="80" w:type="dxa"/>
+              <w:start w:w="120" w:type="dxa"/>
+              <w:bottom w:w="80" w:type="dxa"/>
+              <w:end w:w="120" w:type="dxa"/>
+            </w:tcMar>
+          </w:tcPr>
+          <w:p>
+            <w:pPr>
+              <w:spacing w:before="0" w:after="0" w:line="264" w:lineRule="auto"/>
+              <w:jc w:val="left"/>
+            </w:pPr>
+            <w:r>
+              <w:rPr>
+                <w:rFonts w:ascii="Calibri" w:hAnsi="Calibri"/>
+                <w:b w:val="0"/>
+                <w:color w:val="24313D"/>
+                <w:sz w:val="19"/>
+              </w:rPr>
+              <w:t>Acessar credenciais, aceitar regras, aprovar hash ou enviar ao Kaggle</w:t>
+            </w:r>
+          </w:p>
+        </w:tc>
+      </w:tr>
+      <w:tr>
+        <w:tc>
+          <w:tcPr>
+            <w:tcW w:type="dxa" w:w="2100"/>
+            <w:vAlign w:val="center"/>
+            <w:tcMar>
+              <w:top w:w="80" w:type="dxa"/>
+              <w:start w:w="120" w:type="dxa"/>
+              <w:bottom w:w="80" w:type="dxa"/>
+              <w:end w:w="120" w:type="dxa"/>
+            </w:tcMar>
+          </w:tcPr>
+          <w:p>
+            <w:pPr>
+              <w:spacing w:before="0" w:after="0" w:line="264" w:lineRule="auto"/>
+              <w:jc w:val="left"/>
+            </w:pPr>
+            <w:r>
+              <w:rPr>
+                <w:rFonts w:ascii="Calibri" w:hAnsi="Calibri"/>
+                <w:b w:val="0"/>
+                <w:color w:val="24313D"/>
+                <w:sz w:val="19"/>
+              </w:rPr>
+              <w:t>Autoridade final</w:t>
+            </w:r>
+          </w:p>
+        </w:tc>
+        <w:tc>
+          <w:tcPr>
+            <w:tcW w:type="dxa" w:w="7260"/>
+            <w:vAlign w:val="center"/>
+            <w:tcMar>
+              <w:top w:w="80" w:type="dxa"/>
+              <w:start w:w="120" w:type="dxa"/>
+              <w:bottom w:w="80" w:type="dxa"/>
+              <w:end w:w="120" w:type="dxa"/>
+            </w:tcMar>
+          </w:tcPr>
+          <w:p>
+            <w:pPr>
+              <w:spacing w:before="0" w:after="0" w:line="264" w:lineRule="auto"/>
+              <w:jc w:val="left"/>
+            </w:pPr>
+            <w:r>
+              <w:rPr>
+                <w:rFonts w:ascii="Calibri" w:hAnsi="Calibri"/>
+                <w:b w:val="0"/>
+                <w:color w:val="24313D"/>
+                <w:sz w:val="19"/>
+              </w:rPr>
+              <w:t>Codigo deterministico para validacoes; usuario para decisoes externas</w:t>
+            </w:r>
+          </w:p>
+        </w:tc>
+      </w:tr>
+    </w:tbl>
+    <w:p>
+      <w:pPr>
+        <w:spacing w:after="40"/>
+      </w:pPr>
+    </w:p>
+    <w:tbl>
+      <w:tblPr>
+        <w:jc w:val="left"/>
+        <w:tblLook w:firstColumn="1" w:firstRow="1" w:lastColumn="0" w:lastRow="0" w:noHBand="0" w:noVBand="1" w:val="04A0"/>
+        <w:tblW w:w="9360" w:type="dxa"/>
+        <w:tblInd w:w="120" w:type="dxa"/>
+        <w:tblLayout w:type="fixed"/>
+      </w:tblPr>
+      <w:tblGrid>
+        <w:gridCol w:w="9360"/>
+      </w:tblGrid>
+      <w:tr>
+        <w:tc>
+          <w:tcPr>
+            <w:tcW w:type="dxa" w:w="9360"/>
+            <w:shd w:fill="F1ECFA"/>
+            <w:vAlign w:val="center"/>
+            <w:tcMar>
+              <w:top w:w="80" w:type="dxa"/>
+              <w:start w:w="120" w:type="dxa"/>
+              <w:bottom w:w="80" w:type="dxa"/>
+              <w:end w:w="120" w:type="dxa"/>
+            </w:tcMar>
+          </w:tcPr>
+          <w:p>
+            <w:pPr>
+              <w:spacing w:after="0"/>
+            </w:pPr>
+            <w:r>
+              <w:rPr>
+                <w:rFonts w:ascii="Calibri" w:hAnsi="Calibri"/>
+                <w:b/>
+                <w:color w:val="7257A6"/>
+                <w:sz w:val="21"/>
+              </w:rPr>
+              <w:t xml:space="preserve">Guardrails da LLM: </w:t>
+            </w:r>
+            <w:r>
+              <w:rPr>
+                <w:rFonts w:ascii="Calibri" w:hAnsi="Calibri"/>
+                <w:color w:val="24313D"/>
+                <w:sz w:val="21"/>
+              </w:rPr>
+              <w:t>somente leitura de artefatos permitidos; saida estruturada; nenhuma credencial no prompt; nenhuma chamada direta a API Kaggle; toda alteracao de contrato ou experimento exige revisao humana.</w:t>
+            </w:r>
+          </w:p>
+        </w:tc>
+      </w:tr>
+    </w:tbl>
+    <w:p>
+      <w:pPr>
+        <w:spacing w:after="20"/>
+      </w:pPr>
     </w:p>
     <w:p>
       <w:pPr>
@@ -3186,6 +3739,41 @@
     </w:p>
     <w:p>
       <w:pPr>
+        <w:pStyle w:val="Heading2"/>
+        <w:keepNext/>
+      </w:pPr>
+      <w:r>
+        <w:t>5.5 Verificar Ollama e a LLM local</w:t>
+      </w:r>
+    </w:p>
+    <w:p>
+      <w:pPr>
+        <w:spacing w:before="80" w:after="160" w:line="252" w:lineRule="auto"/>
+        <w:ind w:left="259" w:right="259"/>
+        <w:shd w:fill="EEF2F5"/>
+      </w:pPr>
+      <w:r>
+        <w:rPr>
+          <w:rFonts w:ascii="Consolas" w:hAnsi="Consolas"/>
+          <w:color w:val="203040"/>
+          <w:sz w:val="18"/>
+        </w:rPr>
+        <w:t>.\.venv\Scripts\kaggle-slaying.exe doctor</w:t>
+      </w:r>
+    </w:p>
+    <w:p>
+      <w:r>
+        <w:rPr>
+          <w:rFonts w:ascii="Calibri" w:hAnsi="Calibri"/>
+          <w:i w:val="0"/>
+          <w:color w:val="24313D"/>
+          <w:sz w:val="22"/>
+        </w:rPr>
+        <w:t>O diagnostico mostra Ollama e Servico Ollama como componentes opcionais. Atualmente nao existe uma opcao do menu que entregue controle do workflow a uma LLM. Quando o agente consultivo for conectado, ele devera apenas produzir sugestoes salvas para revisao; o comportamento deterministico existente permanecera como gate.</w:t>
+      </w:r>
+    </w:p>
+    <w:p>
+      <w:pPr>
         <w:pStyle w:val="Heading1"/>
         <w:keepNext/>
       </w:pPr>
@@ -3351,7 +3939,7 @@
           <w:color w:val="24313D"/>
           <w:sz w:val="22"/>
         </w:rPr>
-        <w:t>Agent local via Ollama para resumir relatorios e propor hipoteses, sem autorizar envios.</w:t>
+        <w:t>Conectar o LLM Assistant via Ollama para resumir relatorios e propor hipoteses estruturadas, sem autorizar envios.</w:t>
       </w:r>
     </w:p>
     <w:p>

</xml_diff>